<commit_message>
E3: C1 ejecutivo — tabla de contexto internacional + dato CNDH corregido
- docs/09-datos-mercado.md §1c: datos internacionales 65+ con fuentes
  (US Census, Statistics Japan, Destatis, UN WPP 2022) marcados ⚠ se estima
- Criterio 1 del ejecutivo: tabla 7 filas (MX/EE.UU./Japón/Alemania/LatAm/Global)
- CNDH corregido: "58 de 1,500 residencias" con hallazgos documentados

Co-Authored-By: Claude Sonnet 4.6 <noreply@anthropic.com>
</commit_message>
<xml_diff>
--- a/business/CareSignal_Criterios_Concurso_v1.docx
+++ b/business/CareSignal_Criterios_Concurso_v1.docx
@@ -228,7 +228,7 @@
           <w:sz w:val="22"/>
           <w:szCs w:val="22"/>
         </w:rPr>
-        <w:t xml:space="preserve"> adultos mayores sin trazabilidad operativa, en instalaciones que la CNDH supervisó en </w:t>
+        <w:t xml:space="preserve"> adultos mayores sin trazabilidad operativa, en instalaciones que la CNDH solo pudo inspeccionar en </w:t>
       </w:r>
       <w:r>
         <w:rPr>
@@ -239,7 +239,7 @@
           <w:sz w:val="22"/>
           <w:szCs w:val="22"/>
         </w:rPr>
-        <w:t xml:space="preserve">menos del 4% de los casos</w:t>
+        <w:t xml:space="preserve">58 de más de 1,500 residencias</w:t>
       </w:r>
       <w:r>
         <w:rPr>
@@ -248,9 +248,931 @@
           <w:sz w:val="22"/>
           <w:szCs w:val="22"/>
         </w:rPr>
-        <w:t xml:space="preserve"> durante la pandemia (CNDH ISP-12/2020).</w:t>
+        <w:t xml:space="preserve"> del país (CNDH ISP-12/2020). En las que logró visitar documentó condiciones de abandono, falta de personal y deficiencias operativas.</w:t>
       </w:r>
     </w:p>
+    <w:p>
+      <w:pPr>
+        <w:pStyle w:val="Heading2"/>
+        <w:pBdr>
+          <w:bottom w:val="single" w:color="D6EAF8" w:sz="6"/>
+        </w:pBdr>
+        <w:spacing w:after="120" w:before="240"/>
+      </w:pPr>
+      <w:r>
+        <w:rPr>
+          <w:rFonts w:ascii="Calibri" w:cs="Calibri" w:eastAsia="Calibri" w:hAnsi="Calibri"/>
+          <w:b/>
+          <w:bCs/>
+          <w:color w:val="1A5276"/>
+          <w:sz w:val="26"/>
+          <w:szCs w:val="26"/>
+        </w:rPr>
+        <w:t xml:space="preserve">Contexto internacional — escala global del problema</w:t>
+      </w:r>
+    </w:p>
+    <w:p>
+      <w:pPr>
+        <w:spacing w:after="120"/>
+        <w:ind w:left="566"/>
+      </w:pPr>
+      <w:r>
+        <w:rPr>
+          <w:rFonts w:ascii="Calibri" w:cs="Calibri" w:eastAsia="Calibri" w:hAnsi="Calibri"/>
+          <w:i/>
+          <w:iCs/>
+          <w:color w:val="CA6F1E"/>
+          <w:sz w:val="20"/>
+          <w:szCs w:val="20"/>
+        </w:rPr>
+        <w:t xml:space="preserve">⚠ Nota: Se estima (fuentes: US Census Bureau, Statistics Japan, Destatis, UN World Population Prospects 2022). Datos no verificados directamente — declarar ante jueces.</w:t>
+      </w:r>
+    </w:p>
+    <w:tbl>
+      <w:tblPr>
+        <w:tblW w:type="dxa" w:w="9000"/>
+        <w:tblBorders>
+          <w:top w:val="single" w:color="auto" w:sz="4"/>
+          <w:left w:val="single" w:color="auto" w:sz="4"/>
+          <w:bottom w:val="single" w:color="auto" w:sz="4"/>
+          <w:right w:val="single" w:color="auto" w:sz="4"/>
+          <w:insideH w:val="single" w:color="auto" w:sz="4"/>
+          <w:insideV w:val="single" w:color="auto" w:sz="4"/>
+        </w:tblBorders>
+        <w:tblCellMar>
+          <w:top w:type="dxa" w:w="0"/>
+          <w:left w:type="dxa" w:w="0"/>
+          <w:bottom w:type="dxa" w:w="0"/>
+          <w:right w:type="dxa" w:w="0"/>
+        </w:tblCellMar>
+      </w:tblPr>
+      <w:tblGrid>
+        <w:gridCol w:w="100"/>
+        <w:gridCol w:w="100"/>
+        <w:gridCol w:w="100"/>
+        <w:gridCol w:w="100"/>
+      </w:tblGrid>
+      <w:tr>
+        <w:trPr>
+          <w:tblHeader/>
+        </w:trPr>
+        <w:tc>
+          <w:tcPr>
+            <w:tcW w:type="dxa" w:w="2500"/>
+            <w:shd w:fill="1A5276" w:val="clear"/>
+            <w:tcMar>
+              <w:top w:type="dxa" w:w="60"/>
+              <w:left w:type="dxa" w:w="100"/>
+              <w:bottom w:type="dxa" w:w="60"/>
+              <w:right w:type="dxa" w:w="100"/>
+            </w:tcMar>
+          </w:tcPr>
+          <w:p>
+            <w:pPr>
+              <w:spacing w:after="60" w:before="60"/>
+            </w:pPr>
+            <w:r>
+              <w:rPr>
+                <w:rFonts w:ascii="Calibri" w:cs="Calibri" w:eastAsia="Calibri" w:hAnsi="Calibri"/>
+                <w:b/>
+                <w:bCs/>
+                <w:color w:val="FFFFFF"/>
+                <w:sz w:val="18"/>
+                <w:szCs w:val="18"/>
+              </w:rPr>
+              <w:t xml:space="preserve">País / Región</w:t>
+            </w:r>
+          </w:p>
+        </w:tc>
+        <w:tc>
+          <w:tcPr>
+            <w:tcW w:type="dxa" w:w="2000"/>
+            <w:shd w:fill="1A5276" w:val="clear"/>
+            <w:tcMar>
+              <w:top w:type="dxa" w:w="60"/>
+              <w:left w:type="dxa" w:w="100"/>
+              <w:bottom w:type="dxa" w:w="60"/>
+              <w:right w:type="dxa" w:w="100"/>
+            </w:tcMar>
+          </w:tcPr>
+          <w:p>
+            <w:pPr>
+              <w:spacing w:after="60" w:before="60"/>
+            </w:pPr>
+            <w:r>
+              <w:rPr>
+                <w:rFonts w:ascii="Calibri" w:cs="Calibri" w:eastAsia="Calibri" w:hAnsi="Calibri"/>
+                <w:b/>
+                <w:bCs/>
+                <w:color w:val="FFFFFF"/>
+                <w:sz w:val="18"/>
+                <w:szCs w:val="18"/>
+              </w:rPr>
+              <w:t xml:space="preserve">Se estima personas 65+</w:t>
+            </w:r>
+          </w:p>
+        </w:tc>
+        <w:tc>
+          <w:tcPr>
+            <w:tcW w:type="dxa" w:w="1500"/>
+            <w:shd w:fill="1A5276" w:val="clear"/>
+            <w:tcMar>
+              <w:top w:type="dxa" w:w="60"/>
+              <w:left w:type="dxa" w:w="100"/>
+              <w:bottom w:type="dxa" w:w="60"/>
+              <w:right w:type="dxa" w:w="100"/>
+            </w:tcMar>
+          </w:tcPr>
+          <w:p>
+            <w:pPr>
+              <w:spacing w:after="60" w:before="60"/>
+            </w:pPr>
+            <w:r>
+              <w:rPr>
+                <w:rFonts w:ascii="Calibri" w:cs="Calibri" w:eastAsia="Calibri" w:hAnsi="Calibri"/>
+                <w:b/>
+                <w:bCs/>
+                <w:color w:val="FFFFFF"/>
+                <w:sz w:val="18"/>
+                <w:szCs w:val="18"/>
+              </w:rPr>
+              <w:t xml:space="preserve">% de población</w:t>
+            </w:r>
+          </w:p>
+        </w:tc>
+        <w:tc>
+          <w:tcPr>
+            <w:tcW w:type="dxa" w:w="3000"/>
+            <w:shd w:fill="1A5276" w:val="clear"/>
+            <w:tcMar>
+              <w:top w:type="dxa" w:w="60"/>
+              <w:left w:type="dxa" w:w="100"/>
+              <w:bottom w:type="dxa" w:w="60"/>
+              <w:right w:type="dxa" w:w="100"/>
+            </w:tcMar>
+          </w:tcPr>
+          <w:p>
+            <w:pPr>
+              <w:spacing w:after="60" w:before="60"/>
+            </w:pPr>
+            <w:r>
+              <w:rPr>
+                <w:rFonts w:ascii="Calibri" w:cs="Calibri" w:eastAsia="Calibri" w:hAnsi="Calibri"/>
+                <w:b/>
+                <w:bCs/>
+                <w:color w:val="FFFFFF"/>
+                <w:sz w:val="18"/>
+                <w:szCs w:val="18"/>
+              </w:rPr>
+              <w:t xml:space="preserve">Fuente de referencia</w:t>
+            </w:r>
+          </w:p>
+        </w:tc>
+      </w:tr>
+      <w:tr>
+        <w:tc>
+          <w:tcPr>
+            <w:tcW w:type="dxa" w:w="2500"/>
+            <w:shd w:fill="FFFFFF" w:val="clear"/>
+            <w:tcMar>
+              <w:top w:type="dxa" w:w="60"/>
+              <w:left w:type="dxa" w:w="100"/>
+              <w:bottom w:type="dxa" w:w="60"/>
+              <w:right w:type="dxa" w:w="100"/>
+            </w:tcMar>
+          </w:tcPr>
+          <w:p>
+            <w:pPr>
+              <w:spacing w:after="60" w:before="60"/>
+            </w:pPr>
+            <w:r>
+              <w:rPr>
+                <w:rFonts w:ascii="Calibri" w:cs="Calibri" w:eastAsia="Calibri" w:hAnsi="Calibri"/>
+                <w:color w:val="000000"/>
+                <w:sz w:val="18"/>
+                <w:szCs w:val="18"/>
+              </w:rPr>
+              <w:t xml:space="preserve">México</w:t>
+            </w:r>
+          </w:p>
+        </w:tc>
+        <w:tc>
+          <w:tcPr>
+            <w:tcW w:type="dxa" w:w="2000"/>
+            <w:shd w:fill="FFFFFF" w:val="clear"/>
+            <w:tcMar>
+              <w:top w:type="dxa" w:w="60"/>
+              <w:left w:type="dxa" w:w="100"/>
+              <w:bottom w:type="dxa" w:w="60"/>
+              <w:right w:type="dxa" w:w="100"/>
+            </w:tcMar>
+          </w:tcPr>
+          <w:p>
+            <w:pPr>
+              <w:spacing w:after="60" w:before="60"/>
+            </w:pPr>
+            <w:r>
+              <w:rPr>
+                <w:rFonts w:ascii="Calibri" w:cs="Calibri" w:eastAsia="Calibri" w:hAnsi="Calibri"/>
+                <w:color w:val="000000"/>
+                <w:sz w:val="18"/>
+                <w:szCs w:val="18"/>
+              </w:rPr>
+              <w:t xml:space="preserve">17.1 millones (60+)</w:t>
+            </w:r>
+          </w:p>
+        </w:tc>
+        <w:tc>
+          <w:tcPr>
+            <w:tcW w:type="dxa" w:w="1500"/>
+            <w:shd w:fill="FFFFFF" w:val="clear"/>
+            <w:tcMar>
+              <w:top w:type="dxa" w:w="60"/>
+              <w:left w:type="dxa" w:w="100"/>
+              <w:bottom w:type="dxa" w:w="60"/>
+              <w:right w:type="dxa" w:w="100"/>
+            </w:tcMar>
+          </w:tcPr>
+          <w:p>
+            <w:pPr>
+              <w:spacing w:after="60" w:before="60"/>
+            </w:pPr>
+            <w:r>
+              <w:rPr>
+                <w:rFonts w:ascii="Calibri" w:cs="Calibri" w:eastAsia="Calibri" w:hAnsi="Calibri"/>
+                <w:color w:val="000000"/>
+                <w:sz w:val="18"/>
+                <w:szCs w:val="18"/>
+              </w:rPr>
+              <w:t xml:space="preserve">12.8 %</w:t>
+            </w:r>
+          </w:p>
+        </w:tc>
+        <w:tc>
+          <w:tcPr>
+            <w:tcW w:type="dxa" w:w="3000"/>
+            <w:shd w:fill="FFFFFF" w:val="clear"/>
+            <w:tcMar>
+              <w:top w:type="dxa" w:w="60"/>
+              <w:left w:type="dxa" w:w="100"/>
+              <w:bottom w:type="dxa" w:w="60"/>
+              <w:right w:type="dxa" w:w="100"/>
+            </w:tcMar>
+          </w:tcPr>
+          <w:p>
+            <w:pPr>
+              <w:spacing w:after="60" w:before="60"/>
+            </w:pPr>
+            <w:r>
+              <w:rPr>
+                <w:rFonts w:ascii="Calibri" w:cs="Calibri" w:eastAsia="Calibri" w:hAnsi="Calibri"/>
+                <w:color w:val="000000"/>
+                <w:sz w:val="18"/>
+                <w:szCs w:val="18"/>
+              </w:rPr>
+              <w:t xml:space="preserve">CONAPO 2025 ✅ verificado</w:t>
+            </w:r>
+          </w:p>
+        </w:tc>
+      </w:tr>
+      <w:tr>
+        <w:tc>
+          <w:tcPr>
+            <w:tcW w:type="dxa" w:w="2500"/>
+            <w:shd w:fill="D6EAF8" w:val="clear"/>
+            <w:tcMar>
+              <w:top w:type="dxa" w:w="60"/>
+              <w:left w:type="dxa" w:w="100"/>
+              <w:bottom w:type="dxa" w:w="60"/>
+              <w:right w:type="dxa" w:w="100"/>
+            </w:tcMar>
+          </w:tcPr>
+          <w:p>
+            <w:pPr>
+              <w:spacing w:after="60" w:before="60"/>
+            </w:pPr>
+            <w:r>
+              <w:rPr>
+                <w:rFonts w:ascii="Calibri" w:cs="Calibri" w:eastAsia="Calibri" w:hAnsi="Calibri"/>
+                <w:color w:val="000000"/>
+                <w:sz w:val="18"/>
+                <w:szCs w:val="18"/>
+              </w:rPr>
+              <w:t xml:space="preserve">Estados Unidos</w:t>
+            </w:r>
+          </w:p>
+        </w:tc>
+        <w:tc>
+          <w:tcPr>
+            <w:tcW w:type="dxa" w:w="2000"/>
+            <w:shd w:fill="D6EAF8" w:val="clear"/>
+            <w:tcMar>
+              <w:top w:type="dxa" w:w="60"/>
+              <w:left w:type="dxa" w:w="100"/>
+              <w:bottom w:type="dxa" w:w="60"/>
+              <w:right w:type="dxa" w:w="100"/>
+            </w:tcMar>
+          </w:tcPr>
+          <w:p>
+            <w:pPr>
+              <w:spacing w:after="60" w:before="60"/>
+            </w:pPr>
+            <w:r>
+              <w:rPr>
+                <w:rFonts w:ascii="Calibri" w:cs="Calibri" w:eastAsia="Calibri" w:hAnsi="Calibri"/>
+                <w:color w:val="000000"/>
+                <w:sz w:val="18"/>
+                <w:szCs w:val="18"/>
+              </w:rPr>
+              <w:t xml:space="preserve">~57 millones</w:t>
+            </w:r>
+          </w:p>
+        </w:tc>
+        <w:tc>
+          <w:tcPr>
+            <w:tcW w:type="dxa" w:w="1500"/>
+            <w:shd w:fill="D6EAF8" w:val="clear"/>
+            <w:tcMar>
+              <w:top w:type="dxa" w:w="60"/>
+              <w:left w:type="dxa" w:w="100"/>
+              <w:bottom w:type="dxa" w:w="60"/>
+              <w:right w:type="dxa" w:w="100"/>
+            </w:tcMar>
+          </w:tcPr>
+          <w:p>
+            <w:pPr>
+              <w:spacing w:after="60" w:before="60"/>
+            </w:pPr>
+            <w:r>
+              <w:rPr>
+                <w:rFonts w:ascii="Calibri" w:cs="Calibri" w:eastAsia="Calibri" w:hAnsi="Calibri"/>
+                <w:color w:val="000000"/>
+                <w:sz w:val="18"/>
+                <w:szCs w:val="18"/>
+              </w:rPr>
+              <w:t xml:space="preserve">~17 %</w:t>
+            </w:r>
+          </w:p>
+        </w:tc>
+        <w:tc>
+          <w:tcPr>
+            <w:tcW w:type="dxa" w:w="3000"/>
+            <w:shd w:fill="D6EAF8" w:val="clear"/>
+            <w:tcMar>
+              <w:top w:type="dxa" w:w="60"/>
+              <w:left w:type="dxa" w:w="100"/>
+              <w:bottom w:type="dxa" w:w="60"/>
+              <w:right w:type="dxa" w:w="100"/>
+            </w:tcMar>
+          </w:tcPr>
+          <w:p>
+            <w:pPr>
+              <w:spacing w:after="60" w:before="60"/>
+            </w:pPr>
+            <w:r>
+              <w:rPr>
+                <w:rFonts w:ascii="Calibri" w:cs="Calibri" w:eastAsia="Calibri" w:hAnsi="Calibri"/>
+                <w:color w:val="000000"/>
+                <w:sz w:val="18"/>
+                <w:szCs w:val="18"/>
+              </w:rPr>
+              <w:t xml:space="preserve">US Census Bureau 2023</w:t>
+            </w:r>
+          </w:p>
+        </w:tc>
+      </w:tr>
+      <w:tr>
+        <w:tc>
+          <w:tcPr>
+            <w:tcW w:type="dxa" w:w="2500"/>
+            <w:shd w:fill="FFFFFF" w:val="clear"/>
+            <w:tcMar>
+              <w:top w:type="dxa" w:w="60"/>
+              <w:left w:type="dxa" w:w="100"/>
+              <w:bottom w:type="dxa" w:w="60"/>
+              <w:right w:type="dxa" w:w="100"/>
+            </w:tcMar>
+          </w:tcPr>
+          <w:p>
+            <w:pPr>
+              <w:spacing w:after="60" w:before="60"/>
+            </w:pPr>
+            <w:r>
+              <w:rPr>
+                <w:rFonts w:ascii="Calibri" w:cs="Calibri" w:eastAsia="Calibri" w:hAnsi="Calibri"/>
+                <w:color w:val="000000"/>
+                <w:sz w:val="18"/>
+                <w:szCs w:val="18"/>
+              </w:rPr>
+              <w:t xml:space="preserve">Japón</w:t>
+            </w:r>
+          </w:p>
+        </w:tc>
+        <w:tc>
+          <w:tcPr>
+            <w:tcW w:type="dxa" w:w="2000"/>
+            <w:shd w:fill="FFFFFF" w:val="clear"/>
+            <w:tcMar>
+              <w:top w:type="dxa" w:w="60"/>
+              <w:left w:type="dxa" w:w="100"/>
+              <w:bottom w:type="dxa" w:w="60"/>
+              <w:right w:type="dxa" w:w="100"/>
+            </w:tcMar>
+          </w:tcPr>
+          <w:p>
+            <w:pPr>
+              <w:spacing w:after="60" w:before="60"/>
+            </w:pPr>
+            <w:r>
+              <w:rPr>
+                <w:rFonts w:ascii="Calibri" w:cs="Calibri" w:eastAsia="Calibri" w:hAnsi="Calibri"/>
+                <w:color w:val="000000"/>
+                <w:sz w:val="18"/>
+                <w:szCs w:val="18"/>
+              </w:rPr>
+              <w:t xml:space="preserve">~36 millones</w:t>
+            </w:r>
+          </w:p>
+        </w:tc>
+        <w:tc>
+          <w:tcPr>
+            <w:tcW w:type="dxa" w:w="1500"/>
+            <w:shd w:fill="FFFFFF" w:val="clear"/>
+            <w:tcMar>
+              <w:top w:type="dxa" w:w="60"/>
+              <w:left w:type="dxa" w:w="100"/>
+              <w:bottom w:type="dxa" w:w="60"/>
+              <w:right w:type="dxa" w:w="100"/>
+            </w:tcMar>
+          </w:tcPr>
+          <w:p>
+            <w:pPr>
+              <w:spacing w:after="60" w:before="60"/>
+            </w:pPr>
+            <w:r>
+              <w:rPr>
+                <w:rFonts w:ascii="Calibri" w:cs="Calibri" w:eastAsia="Calibri" w:hAnsi="Calibri"/>
+                <w:color w:val="000000"/>
+                <w:sz w:val="18"/>
+                <w:szCs w:val="18"/>
+              </w:rPr>
+              <w:t xml:space="preserve">~29 %</w:t>
+            </w:r>
+          </w:p>
+        </w:tc>
+        <w:tc>
+          <w:tcPr>
+            <w:tcW w:type="dxa" w:w="3000"/>
+            <w:shd w:fill="FFFFFF" w:val="clear"/>
+            <w:tcMar>
+              <w:top w:type="dxa" w:w="60"/>
+              <w:left w:type="dxa" w:w="100"/>
+              <w:bottom w:type="dxa" w:w="60"/>
+              <w:right w:type="dxa" w:w="100"/>
+            </w:tcMar>
+          </w:tcPr>
+          <w:p>
+            <w:pPr>
+              <w:spacing w:after="60" w:before="60"/>
+            </w:pPr>
+            <w:r>
+              <w:rPr>
+                <w:rFonts w:ascii="Calibri" w:cs="Calibri" w:eastAsia="Calibri" w:hAnsi="Calibri"/>
+                <w:color w:val="000000"/>
+                <w:sz w:val="18"/>
+                <w:szCs w:val="18"/>
+              </w:rPr>
+              <w:t xml:space="preserve">Statistics Japan 2023</w:t>
+            </w:r>
+          </w:p>
+        </w:tc>
+      </w:tr>
+      <w:tr>
+        <w:tc>
+          <w:tcPr>
+            <w:tcW w:type="dxa" w:w="2500"/>
+            <w:shd w:fill="D6EAF8" w:val="clear"/>
+            <w:tcMar>
+              <w:top w:type="dxa" w:w="60"/>
+              <w:left w:type="dxa" w:w="100"/>
+              <w:bottom w:type="dxa" w:w="60"/>
+              <w:right w:type="dxa" w:w="100"/>
+            </w:tcMar>
+          </w:tcPr>
+          <w:p>
+            <w:pPr>
+              <w:spacing w:after="60" w:before="60"/>
+            </w:pPr>
+            <w:r>
+              <w:rPr>
+                <w:rFonts w:ascii="Calibri" w:cs="Calibri" w:eastAsia="Calibri" w:hAnsi="Calibri"/>
+                <w:color w:val="000000"/>
+                <w:sz w:val="18"/>
+                <w:szCs w:val="18"/>
+              </w:rPr>
+              <w:t xml:space="preserve">Alemania</w:t>
+            </w:r>
+          </w:p>
+        </w:tc>
+        <w:tc>
+          <w:tcPr>
+            <w:tcW w:type="dxa" w:w="2000"/>
+            <w:shd w:fill="D6EAF8" w:val="clear"/>
+            <w:tcMar>
+              <w:top w:type="dxa" w:w="60"/>
+              <w:left w:type="dxa" w:w="100"/>
+              <w:bottom w:type="dxa" w:w="60"/>
+              <w:right w:type="dxa" w:w="100"/>
+            </w:tcMar>
+          </w:tcPr>
+          <w:p>
+            <w:pPr>
+              <w:spacing w:after="60" w:before="60"/>
+            </w:pPr>
+            <w:r>
+              <w:rPr>
+                <w:rFonts w:ascii="Calibri" w:cs="Calibri" w:eastAsia="Calibri" w:hAnsi="Calibri"/>
+                <w:color w:val="000000"/>
+                <w:sz w:val="18"/>
+                <w:szCs w:val="18"/>
+              </w:rPr>
+              <w:t xml:space="preserve">~18 millones</w:t>
+            </w:r>
+          </w:p>
+        </w:tc>
+        <w:tc>
+          <w:tcPr>
+            <w:tcW w:type="dxa" w:w="1500"/>
+            <w:shd w:fill="D6EAF8" w:val="clear"/>
+            <w:tcMar>
+              <w:top w:type="dxa" w:w="60"/>
+              <w:left w:type="dxa" w:w="100"/>
+              <w:bottom w:type="dxa" w:w="60"/>
+              <w:right w:type="dxa" w:w="100"/>
+            </w:tcMar>
+          </w:tcPr>
+          <w:p>
+            <w:pPr>
+              <w:spacing w:after="60" w:before="60"/>
+            </w:pPr>
+            <w:r>
+              <w:rPr>
+                <w:rFonts w:ascii="Calibri" w:cs="Calibri" w:eastAsia="Calibri" w:hAnsi="Calibri"/>
+                <w:color w:val="000000"/>
+                <w:sz w:val="18"/>
+                <w:szCs w:val="18"/>
+              </w:rPr>
+              <w:t xml:space="preserve">~22 %</w:t>
+            </w:r>
+          </w:p>
+        </w:tc>
+        <w:tc>
+          <w:tcPr>
+            <w:tcW w:type="dxa" w:w="3000"/>
+            <w:shd w:fill="D6EAF8" w:val="clear"/>
+            <w:tcMar>
+              <w:top w:type="dxa" w:w="60"/>
+              <w:left w:type="dxa" w:w="100"/>
+              <w:bottom w:type="dxa" w:w="60"/>
+              <w:right w:type="dxa" w:w="100"/>
+            </w:tcMar>
+          </w:tcPr>
+          <w:p>
+            <w:pPr>
+              <w:spacing w:after="60" w:before="60"/>
+            </w:pPr>
+            <w:r>
+              <w:rPr>
+                <w:rFonts w:ascii="Calibri" w:cs="Calibri" w:eastAsia="Calibri" w:hAnsi="Calibri"/>
+                <w:color w:val="000000"/>
+                <w:sz w:val="18"/>
+                <w:szCs w:val="18"/>
+              </w:rPr>
+              <w:t xml:space="preserve">Destatis 2023</w:t>
+            </w:r>
+          </w:p>
+        </w:tc>
+      </w:tr>
+      <w:tr>
+        <w:tc>
+          <w:tcPr>
+            <w:tcW w:type="dxa" w:w="2500"/>
+            <w:shd w:fill="FFFFFF" w:val="clear"/>
+            <w:tcMar>
+              <w:top w:type="dxa" w:w="60"/>
+              <w:left w:type="dxa" w:w="100"/>
+              <w:bottom w:type="dxa" w:w="60"/>
+              <w:right w:type="dxa" w:w="100"/>
+            </w:tcMar>
+          </w:tcPr>
+          <w:p>
+            <w:pPr>
+              <w:spacing w:after="60" w:before="60"/>
+            </w:pPr>
+            <w:r>
+              <w:rPr>
+                <w:rFonts w:ascii="Calibri" w:cs="Calibri" w:eastAsia="Calibri" w:hAnsi="Calibri"/>
+                <w:color w:val="000000"/>
+                <w:sz w:val="18"/>
+                <w:szCs w:val="18"/>
+              </w:rPr>
+              <w:t xml:space="preserve">América Latina (65+)</w:t>
+            </w:r>
+          </w:p>
+        </w:tc>
+        <w:tc>
+          <w:tcPr>
+            <w:tcW w:type="dxa" w:w="2000"/>
+            <w:shd w:fill="FFFFFF" w:val="clear"/>
+            <w:tcMar>
+              <w:top w:type="dxa" w:w="60"/>
+              <w:left w:type="dxa" w:w="100"/>
+              <w:bottom w:type="dxa" w:w="60"/>
+              <w:right w:type="dxa" w:w="100"/>
+            </w:tcMar>
+          </w:tcPr>
+          <w:p>
+            <w:pPr>
+              <w:spacing w:after="60" w:before="60"/>
+            </w:pPr>
+            <w:r>
+              <w:rPr>
+                <w:rFonts w:ascii="Calibri" w:cs="Calibri" w:eastAsia="Calibri" w:hAnsi="Calibri"/>
+                <w:color w:val="000000"/>
+                <w:sz w:val="18"/>
+                <w:szCs w:val="18"/>
+              </w:rPr>
+              <w:t xml:space="preserve">~65 millones</w:t>
+            </w:r>
+          </w:p>
+        </w:tc>
+        <w:tc>
+          <w:tcPr>
+            <w:tcW w:type="dxa" w:w="1500"/>
+            <w:shd w:fill="FFFFFF" w:val="clear"/>
+            <w:tcMar>
+              <w:top w:type="dxa" w:w="60"/>
+              <w:left w:type="dxa" w:w="100"/>
+              <w:bottom w:type="dxa" w:w="60"/>
+              <w:right w:type="dxa" w:w="100"/>
+            </w:tcMar>
+          </w:tcPr>
+          <w:p>
+            <w:pPr>
+              <w:spacing w:after="60" w:before="60"/>
+            </w:pPr>
+            <w:r>
+              <w:rPr>
+                <w:rFonts w:ascii="Calibri" w:cs="Calibri" w:eastAsia="Calibri" w:hAnsi="Calibri"/>
+                <w:color w:val="000000"/>
+                <w:sz w:val="18"/>
+                <w:szCs w:val="18"/>
+              </w:rPr>
+              <w:t xml:space="preserve">—</w:t>
+            </w:r>
+          </w:p>
+        </w:tc>
+        <w:tc>
+          <w:tcPr>
+            <w:tcW w:type="dxa" w:w="3000"/>
+            <w:shd w:fill="FFFFFF" w:val="clear"/>
+            <w:tcMar>
+              <w:top w:type="dxa" w:w="60"/>
+              <w:left w:type="dxa" w:w="100"/>
+              <w:bottom w:type="dxa" w:w="60"/>
+              <w:right w:type="dxa" w:w="100"/>
+            </w:tcMar>
+          </w:tcPr>
+          <w:p>
+            <w:pPr>
+              <w:spacing w:after="60" w:before="60"/>
+            </w:pPr>
+            <w:r>
+              <w:rPr>
+                <w:rFonts w:ascii="Calibri" w:cs="Calibri" w:eastAsia="Calibri" w:hAnsi="Calibri"/>
+                <w:color w:val="000000"/>
+                <w:sz w:val="18"/>
+                <w:szCs w:val="18"/>
+              </w:rPr>
+              <w:t xml:space="preserve">CEPAL / ONU 2024 ✅ verificado</w:t>
+            </w:r>
+          </w:p>
+        </w:tc>
+      </w:tr>
+      <w:tr>
+        <w:tc>
+          <w:tcPr>
+            <w:tcW w:type="dxa" w:w="2500"/>
+            <w:shd w:fill="D6EAF8" w:val="clear"/>
+            <w:tcMar>
+              <w:top w:type="dxa" w:w="60"/>
+              <w:left w:type="dxa" w:w="100"/>
+              <w:bottom w:type="dxa" w:w="60"/>
+              <w:right w:type="dxa" w:w="100"/>
+            </w:tcMar>
+          </w:tcPr>
+          <w:p>
+            <w:pPr>
+              <w:spacing w:after="60" w:before="60"/>
+            </w:pPr>
+            <w:r>
+              <w:rPr>
+                <w:rFonts w:ascii="Calibri" w:cs="Calibri" w:eastAsia="Calibri" w:hAnsi="Calibri"/>
+                <w:color w:val="000000"/>
+                <w:sz w:val="18"/>
+                <w:szCs w:val="18"/>
+              </w:rPr>
+              <w:t xml:space="preserve">Global (total mundial)</w:t>
+            </w:r>
+          </w:p>
+        </w:tc>
+        <w:tc>
+          <w:tcPr>
+            <w:tcW w:type="dxa" w:w="2000"/>
+            <w:shd w:fill="D6EAF8" w:val="clear"/>
+            <w:tcMar>
+              <w:top w:type="dxa" w:w="60"/>
+              <w:left w:type="dxa" w:w="100"/>
+              <w:bottom w:type="dxa" w:w="60"/>
+              <w:right w:type="dxa" w:w="100"/>
+            </w:tcMar>
+          </w:tcPr>
+          <w:p>
+            <w:pPr>
+              <w:spacing w:after="60" w:before="60"/>
+            </w:pPr>
+            <w:r>
+              <w:rPr>
+                <w:rFonts w:ascii="Calibri" w:cs="Calibri" w:eastAsia="Calibri" w:hAnsi="Calibri"/>
+                <w:color w:val="000000"/>
+                <w:sz w:val="18"/>
+                <w:szCs w:val="18"/>
+              </w:rPr>
+              <w:t xml:space="preserve">~771 millones</w:t>
+            </w:r>
+          </w:p>
+        </w:tc>
+        <w:tc>
+          <w:tcPr>
+            <w:tcW w:type="dxa" w:w="1500"/>
+            <w:shd w:fill="D6EAF8" w:val="clear"/>
+            <w:tcMar>
+              <w:top w:type="dxa" w:w="60"/>
+              <w:left w:type="dxa" w:w="100"/>
+              <w:bottom w:type="dxa" w:w="60"/>
+              <w:right w:type="dxa" w:w="100"/>
+            </w:tcMar>
+          </w:tcPr>
+          <w:p>
+            <w:pPr>
+              <w:spacing w:after="60" w:before="60"/>
+            </w:pPr>
+            <w:r>
+              <w:rPr>
+                <w:rFonts w:ascii="Calibri" w:cs="Calibri" w:eastAsia="Calibri" w:hAnsi="Calibri"/>
+                <w:color w:val="000000"/>
+                <w:sz w:val="18"/>
+                <w:szCs w:val="18"/>
+              </w:rPr>
+              <w:t xml:space="preserve">~10 %</w:t>
+            </w:r>
+          </w:p>
+        </w:tc>
+        <w:tc>
+          <w:tcPr>
+            <w:tcW w:type="dxa" w:w="3000"/>
+            <w:shd w:fill="D6EAF8" w:val="clear"/>
+            <w:tcMar>
+              <w:top w:type="dxa" w:w="60"/>
+              <w:left w:type="dxa" w:w="100"/>
+              <w:bottom w:type="dxa" w:w="60"/>
+              <w:right w:type="dxa" w:w="100"/>
+            </w:tcMar>
+          </w:tcPr>
+          <w:p>
+            <w:pPr>
+              <w:spacing w:after="60" w:before="60"/>
+            </w:pPr>
+            <w:r>
+              <w:rPr>
+                <w:rFonts w:ascii="Calibri" w:cs="Calibri" w:eastAsia="Calibri" w:hAnsi="Calibri"/>
+                <w:color w:val="000000"/>
+                <w:sz w:val="18"/>
+                <w:szCs w:val="18"/>
+              </w:rPr>
+              <w:t xml:space="preserve">UN World Population Prospects 2022</w:t>
+            </w:r>
+          </w:p>
+        </w:tc>
+      </w:tr>
+      <w:tr>
+        <w:tc>
+          <w:tcPr>
+            <w:tcW w:type="dxa" w:w="2500"/>
+            <w:shd w:fill="FFFFFF" w:val="clear"/>
+            <w:tcMar>
+              <w:top w:type="dxa" w:w="60"/>
+              <w:left w:type="dxa" w:w="100"/>
+              <w:bottom w:type="dxa" w:w="60"/>
+              <w:right w:type="dxa" w:w="100"/>
+            </w:tcMar>
+          </w:tcPr>
+          <w:p>
+            <w:pPr>
+              <w:spacing w:after="60" w:before="60"/>
+            </w:pPr>
+            <w:r>
+              <w:rPr>
+                <w:rFonts w:ascii="Calibri" w:cs="Calibri" w:eastAsia="Calibri" w:hAnsi="Calibri"/>
+                <w:color w:val="000000"/>
+                <w:sz w:val="18"/>
+                <w:szCs w:val="18"/>
+              </w:rPr>
+              <w:t xml:space="preserve">Proyección global 2050</w:t>
+            </w:r>
+          </w:p>
+        </w:tc>
+        <w:tc>
+          <w:tcPr>
+            <w:tcW w:type="dxa" w:w="2000"/>
+            <w:shd w:fill="FFFFFF" w:val="clear"/>
+            <w:tcMar>
+              <w:top w:type="dxa" w:w="60"/>
+              <w:left w:type="dxa" w:w="100"/>
+              <w:bottom w:type="dxa" w:w="60"/>
+              <w:right w:type="dxa" w:w="100"/>
+            </w:tcMar>
+          </w:tcPr>
+          <w:p>
+            <w:pPr>
+              <w:spacing w:after="60" w:before="60"/>
+            </w:pPr>
+            <w:r>
+              <w:rPr>
+                <w:rFonts w:ascii="Calibri" w:cs="Calibri" w:eastAsia="Calibri" w:hAnsi="Calibri"/>
+                <w:color w:val="000000"/>
+                <w:sz w:val="18"/>
+                <w:szCs w:val="18"/>
+              </w:rPr>
+              <w:t xml:space="preserve">~1,600 millones</w:t>
+            </w:r>
+          </w:p>
+        </w:tc>
+        <w:tc>
+          <w:tcPr>
+            <w:tcW w:type="dxa" w:w="1500"/>
+            <w:shd w:fill="FFFFFF" w:val="clear"/>
+            <w:tcMar>
+              <w:top w:type="dxa" w:w="60"/>
+              <w:left w:type="dxa" w:w="100"/>
+              <w:bottom w:type="dxa" w:w="60"/>
+              <w:right w:type="dxa" w:w="100"/>
+            </w:tcMar>
+          </w:tcPr>
+          <w:p>
+            <w:pPr>
+              <w:spacing w:after="60" w:before="60"/>
+            </w:pPr>
+            <w:r>
+              <w:rPr>
+                <w:rFonts w:ascii="Calibri" w:cs="Calibri" w:eastAsia="Calibri" w:hAnsi="Calibri"/>
+                <w:color w:val="000000"/>
+                <w:sz w:val="18"/>
+                <w:szCs w:val="18"/>
+              </w:rPr>
+              <w:t xml:space="preserve">~16 %</w:t>
+            </w:r>
+          </w:p>
+        </w:tc>
+        <w:tc>
+          <w:tcPr>
+            <w:tcW w:type="dxa" w:w="3000"/>
+            <w:shd w:fill="FFFFFF" w:val="clear"/>
+            <w:tcMar>
+              <w:top w:type="dxa" w:w="60"/>
+              <w:left w:type="dxa" w:w="100"/>
+              <w:bottom w:type="dxa" w:w="60"/>
+              <w:right w:type="dxa" w:w="100"/>
+            </w:tcMar>
+          </w:tcPr>
+          <w:p>
+            <w:pPr>
+              <w:spacing w:after="60" w:before="60"/>
+            </w:pPr>
+            <w:r>
+              <w:rPr>
+                <w:rFonts w:ascii="Calibri" w:cs="Calibri" w:eastAsia="Calibri" w:hAnsi="Calibri"/>
+                <w:color w:val="000000"/>
+                <w:sz w:val="18"/>
+                <w:szCs w:val="18"/>
+              </w:rPr>
+              <w:t xml:space="preserve">UN World Population Prospects 2022</w:t>
+            </w:r>
+          </w:p>
+        </w:tc>
+      </w:tr>
+    </w:tbl>
+    <w:p/>
     <w:p>
       <w:pPr>
         <w:pStyle w:val="Heading2"/>

</xml_diff>

<commit_message>
E3: CNDH — "muestreo" en lugar de "solo pudo inspeccionar"
Lenguaje más neutral y técnico en guion pitch y documento ejecutivo.

Co-Authored-By: Claude Sonnet 4.6 <noreply@anthropic.com>
</commit_message>
<xml_diff>
--- a/business/CareSignal_Criterios_Concurso_v1.docx
+++ b/business/CareSignal_Criterios_Concurso_v1.docx
@@ -228,7 +228,7 @@
           <w:sz w:val="22"/>
           <w:szCs w:val="22"/>
         </w:rPr>
-        <w:t xml:space="preserve"> adultos mayores sin trazabilidad operativa, en instalaciones que la CNDH solo pudo inspeccionar en </w:t>
+        <w:t xml:space="preserve"> adultos mayores sin trazabilidad operativa, en instalaciones donde la CNDH realizó un muestreo en </w:t>
       </w:r>
       <w:r>
         <w:rPr>
@@ -248,7 +248,7 @@
           <w:sz w:val="22"/>
           <w:szCs w:val="22"/>
         </w:rPr>
-        <w:t xml:space="preserve"> del país (CNDH ISP-12/2020). En las que logró visitar documentó condiciones de abandono, falta de personal y deficiencias operativas.</w:t>
+        <w:t xml:space="preserve"> del país (CNDH ISP-12/2020). En las que visitó documentó condiciones de abandono, falta de personal y deficiencias operativas.</w:t>
       </w:r>
     </w:p>
     <w:p>

</xml_diff>

<commit_message>
E3: CNDH — oración única sin redundancia en guion y ejecutivo
"La CNDH en su informe ISP-12/2020 documentó que de 58 residencias
visitadas se observaron condiciones de abandono, falta de personal
y deficiencias operativas."

Co-Authored-By: Claude Sonnet 4.6 <noreply@anthropic.com>
</commit_message>
<xml_diff>
--- a/business/CareSignal_Criterios_Concurso_v1.docx
+++ b/business/CareSignal_Criterios_Concurso_v1.docx
@@ -228,7 +228,7 @@
           <w:sz w:val="22"/>
           <w:szCs w:val="22"/>
         </w:rPr>
-        <w:t xml:space="preserve"> adultos mayores sin trazabilidad operativa, en instalaciones donde la CNDH realizó un muestreo en </w:t>
+        <w:t xml:space="preserve"> adultos mayores sin trazabilidad operativa. La CNDH en su informe </w:t>
       </w:r>
       <w:r>
         <w:rPr>
@@ -239,7 +239,7 @@
           <w:sz w:val="22"/>
           <w:szCs w:val="22"/>
         </w:rPr>
-        <w:t xml:space="preserve">58 de más de 1,500 residencias</w:t>
+        <w:t xml:space="preserve">ISP-12/2020</w:t>
       </w:r>
       <w:r>
         <w:rPr>
@@ -248,7 +248,27 @@
           <w:sz w:val="22"/>
           <w:szCs w:val="22"/>
         </w:rPr>
-        <w:t xml:space="preserve"> del país (CNDH ISP-12/2020). En las que visitó documentó condiciones de abandono, falta de personal y deficiencias operativas.</w:t>
+        <w:t xml:space="preserve"> documentó que de </w:t>
+      </w:r>
+      <w:r>
+        <w:rPr>
+          <w:rFonts w:ascii="Calibri" w:cs="Calibri" w:eastAsia="Calibri" w:hAnsi="Calibri"/>
+          <w:b/>
+          <w:bCs/>
+          <w:color w:val="000000"/>
+          <w:sz w:val="22"/>
+          <w:szCs w:val="22"/>
+        </w:rPr>
+        <w:t xml:space="preserve">58 residencias visitadas</w:t>
+      </w:r>
+      <w:r>
+        <w:rPr>
+          <w:rFonts w:ascii="Calibri" w:cs="Calibri" w:eastAsia="Calibri" w:hAnsi="Calibri"/>
+          <w:color w:val="000000"/>
+          <w:sz w:val="22"/>
+          <w:szCs w:val="22"/>
+        </w:rPr>
+        <w:t xml:space="preserve"> se observaron condiciones de abandono, falta de personal y deficiencias operativas.</w:t>
       </w:r>
     </w:p>
     <w:p>

</xml_diff>

<commit_message>
E3: bloque 1 — enfoque en gestión operativa, quita argumento de fallecimientos
- Elimina datos de 700K fallecimientos (no sostenible ante preguntas)
- CNDH reenmarcada como evidencia de deficiencias operativas, no mortalidad
- Remate: "consecuencia de no contar con sistemas de gestión operativa"
- Tiempo estimado bloque 1: ~50 s (dentro del margen de 4:00)

Co-Authored-By: Claude Sonnet 4.6 <noreply@anthropic.com>
</commit_message>
<xml_diff>
--- a/business/CareSignal_Criterios_Concurso_v1.docx
+++ b/business/CareSignal_Criterios_Concurso_v1.docx
@@ -228,7 +228,7 @@
           <w:sz w:val="22"/>
           <w:szCs w:val="22"/>
         </w:rPr>
-        <w:t xml:space="preserve"> adultos mayores sin trazabilidad operativa. La CNDH en su informe </w:t>
+        <w:t xml:space="preserve"> adultos mayores sin trazabilidad operativa. En un informe de la CNDH se documentaron condiciones de abandono, falta de personal y deficiencias operativas en residencias de adultos mayores en México — consecuencia de no contar con </w:t>
       </w:r>
       <w:r>
         <w:rPr>
@@ -239,7 +239,7 @@
           <w:sz w:val="22"/>
           <w:szCs w:val="22"/>
         </w:rPr>
-        <w:t xml:space="preserve">ISP-12/2020</w:t>
+        <w:t xml:space="preserve">sistemas de gestión operativa</w:t>
       </w:r>
       <w:r>
         <w:rPr>
@@ -248,27 +248,7 @@
           <w:sz w:val="22"/>
           <w:szCs w:val="22"/>
         </w:rPr>
-        <w:t xml:space="preserve"> documentó que de </w:t>
-      </w:r>
-      <w:r>
-        <w:rPr>
-          <w:rFonts w:ascii="Calibri" w:cs="Calibri" w:eastAsia="Calibri" w:hAnsi="Calibri"/>
-          <w:b/>
-          <w:bCs/>
-          <w:color w:val="000000"/>
-          <w:sz w:val="22"/>
-          <w:szCs w:val="22"/>
-        </w:rPr>
-        <w:t xml:space="preserve">58 residencias visitadas</w:t>
-      </w:r>
-      <w:r>
-        <w:rPr>
-          <w:rFonts w:ascii="Calibri" w:cs="Calibri" w:eastAsia="Calibri" w:hAnsi="Calibri"/>
-          <w:color w:val="000000"/>
-          <w:sz w:val="22"/>
-          <w:szCs w:val="22"/>
-        </w:rPr>
-        <w:t xml:space="preserve"> se observaron condiciones de abandono, falta de personal y deficiencias operativas.</w:t>
+        <w:t xml:space="preserve"> que garanticen que el cuidado ocurrió, en el momento correcto, con la persona correcta.</w:t>
       </w:r>
     </w:p>
     <w:p>

</xml_diff>

<commit_message>
E3: bloque 1 completo — escala global + 4 ángulos del problema
Agrega: EE.UU. 57M · Japón 36M · 770M global · 1,600M ONU 2050.
Cierre económico: multa LGS $234,000 MXN como consecuencia de negocio.
Bloque 1 cubre social, legal, operativo y económico en un solo hook.

Co-Authored-By: Claude Sonnet 4.6 <noreply@anthropic.com>
</commit_message>
<xml_diff>
--- a/business/CareSignal_Criterios_Concurso_v1.docx
+++ b/business/CareSignal_Criterios_Concurso_v1.docx
@@ -228,7 +228,7 @@
           <w:sz w:val="22"/>
           <w:szCs w:val="22"/>
         </w:rPr>
-        <w:t xml:space="preserve"> adultos mayores sin trazabilidad operativa. En un informe de la CNDH se documentaron condiciones de abandono, falta de personal y deficiencias operativas en residencias de adultos mayores en México — consecuencia de no contar con </w:t>
+        <w:t xml:space="preserve"> adultos mayores sin trazabilidad operativa. En un informe de la CNDH se documentaron condiciones de abandono, falta de personal y deficiencias operativas en residencias — consecuencia de no contar con </w:t>
       </w:r>
       <w:r>
         <w:rPr>
@@ -248,7 +248,27 @@
           <w:sz w:val="22"/>
           <w:szCs w:val="22"/>
         </w:rPr>
-        <w:t xml:space="preserve"> que garanticen que el cuidado ocurrió, en el momento correcto, con la persona correcta.</w:t>
+        <w:t xml:space="preserve"> que garanticen que el cuidado ocurrió, en el momento correcto, con la persona correcta. La NOM-031 exige registros permanentes y cualquier inspección, queja o demanda puede llegar sin aviso. Una multa bajo la Ley General de Salud puede superar los </w:t>
+      </w:r>
+      <w:r>
+        <w:rPr>
+          <w:rFonts w:ascii="Calibri" w:cs="Calibri" w:eastAsia="Calibri" w:hAnsi="Calibri"/>
+          <w:b/>
+          <w:bCs/>
+          <w:color w:val="000000"/>
+          <w:sz w:val="22"/>
+          <w:szCs w:val="22"/>
+        </w:rPr>
+        <w:t xml:space="preserve">$234,000 MXN</w:t>
+      </w:r>
+      <w:r>
+        <w:rPr>
+          <w:rFonts w:ascii="Calibri" w:cs="Calibri" w:eastAsia="Calibri" w:hAnsi="Calibri"/>
+          <w:color w:val="000000"/>
+          <w:sz w:val="22"/>
+          <w:szCs w:val="22"/>
+        </w:rPr>
+        <w:t xml:space="preserve"> — y eso es solo la primera.</w:t>
       </w:r>
     </w:p>
     <w:p>

</xml_diff>

<commit_message>
E3: criterios concurso — TAM/SAM/SOM B2C, precios freemium y competencia
- TAM/SAM/SOM: agrega línea B2C (SAM ~2M familias MX, CONAPO 2025)
  y SOM combinado B2B + freemium B2C
- Revenue SOM: precios actualizados ($1,990 / $3,990 / $8,490)
  con escenarios pesimista, equilibrado (sweet spot) y positivo
- Nota: freemium $0 reduce CAC, margen bruto > 80%
- Competencia: CareSignal pasa de "3 planes" a "Freemium + 3 planes"

Co-Authored-By: Claude Sonnet 4.6 <noreply@anthropic.com>
</commit_message>
<xml_diff>
--- a/business/CareSignal_Criterios_Concurso_v1.docx
+++ b/business/CareSignal_Criterios_Concurso_v1.docx
@@ -3937,7 +3937,7 @@
           <w:sz w:val="26"/>
           <w:szCs w:val="26"/>
         </w:rPr>
-        <w:t xml:space="preserve">TAM / SAM / SOM — modelo B2B</w:t>
+        <w:t xml:space="preserve">TAM / SAM / SOM — dos líneas de mercado</w:t>
       </w:r>
     </w:p>
     <w:tbl>
@@ -4020,7 +4020,7 @@
                 <w:sz w:val="18"/>
                 <w:szCs w:val="18"/>
               </w:rPr>
-              <w:t xml:space="preserve">Descripción</w:t>
+              <w:t xml:space="preserve">Línea</w:t>
             </w:r>
           </w:p>
         </w:tc>
@@ -4130,7 +4130,7 @@
                 <w:sz w:val="18"/>
                 <w:szCs w:val="18"/>
               </w:rPr>
-              <w:t xml:space="preserve">Mercado total de cuidados y tecnología geriátrica (MX + LatAm)</w:t>
+              <w:t xml:space="preserve">Cuidados y tecnología geriátrica MX + LatAm</w:t>
             </w:r>
           </w:p>
         </w:tc>
@@ -4210,7 +4210,7 @@
                 <w:sz w:val="18"/>
                 <w:szCs w:val="18"/>
               </w:rPr>
-              <w:t xml:space="preserve">SAM</w:t>
+              <w:t xml:space="preserve">SAM B2B</w:t>
             </w:r>
           </w:p>
         </w:tc>
@@ -4316,6 +4316,112 @@
                 <w:sz w:val="18"/>
                 <w:szCs w:val="18"/>
               </w:rPr>
+              <w:t xml:space="preserve">SAM B2C</w:t>
+            </w:r>
+          </w:p>
+        </w:tc>
+        <w:tc>
+          <w:tcPr>
+            <w:tcW w:type="dxa" w:w="3000"/>
+            <w:shd w:fill="FFFFFF" w:val="clear"/>
+            <w:tcMar>
+              <w:top w:type="dxa" w:w="60"/>
+              <w:left w:type="dxa" w:w="100"/>
+              <w:bottom w:type="dxa" w:w="60"/>
+              <w:right w:type="dxa" w:w="100"/>
+            </w:tcMar>
+          </w:tcPr>
+          <w:p>
+            <w:pPr>
+              <w:spacing w:after="60" w:before="60"/>
+            </w:pPr>
+            <w:r>
+              <w:rPr>
+                <w:rFonts w:ascii="Calibri" w:cs="Calibri" w:eastAsia="Calibri" w:hAnsi="Calibri"/>
+                <w:color w:val="000000"/>
+                <w:sz w:val="18"/>
+                <w:szCs w:val="18"/>
+              </w:rPr>
+              <w:t xml:space="preserve">Familias mexicanas con cuidado activo de adulto mayor</w:t>
+            </w:r>
+          </w:p>
+        </w:tc>
+        <w:tc>
+          <w:tcPr>
+            <w:tcW w:type="dxa" w:w="2500"/>
+            <w:shd w:fill="FFFFFF" w:val="clear"/>
+            <w:tcMar>
+              <w:top w:type="dxa" w:w="60"/>
+              <w:left w:type="dxa" w:w="100"/>
+              <w:bottom w:type="dxa" w:w="60"/>
+              <w:right w:type="dxa" w:w="100"/>
+            </w:tcMar>
+          </w:tcPr>
+          <w:p>
+            <w:pPr>
+              <w:spacing w:after="60" w:before="60"/>
+            </w:pPr>
+            <w:r>
+              <w:rPr>
+                <w:rFonts w:ascii="Calibri" w:cs="Calibri" w:eastAsia="Calibri" w:hAnsi="Calibri"/>
+                <w:color w:val="000000"/>
+                <w:sz w:val="18"/>
+                <w:szCs w:val="18"/>
+              </w:rPr>
+              <w:t xml:space="preserve">~2M familias</w:t>
+            </w:r>
+          </w:p>
+        </w:tc>
+        <w:tc>
+          <w:tcPr>
+            <w:tcW w:type="dxa" w:w="2300"/>
+            <w:shd w:fill="FFFFFF" w:val="clear"/>
+            <w:tcMar>
+              <w:top w:type="dxa" w:w="60"/>
+              <w:left w:type="dxa" w:w="100"/>
+              <w:bottom w:type="dxa" w:w="60"/>
+              <w:right w:type="dxa" w:w="100"/>
+            </w:tcMar>
+          </w:tcPr>
+          <w:p>
+            <w:pPr>
+              <w:spacing w:after="60" w:before="60"/>
+            </w:pPr>
+            <w:r>
+              <w:rPr>
+                <w:rFonts w:ascii="Calibri" w:cs="Calibri" w:eastAsia="Calibri" w:hAnsi="Calibri"/>
+                <w:color w:val="000000"/>
+                <w:sz w:val="18"/>
+                <w:szCs w:val="18"/>
+              </w:rPr>
+              <w:t xml:space="preserve">CONAPO 2025 · hijos que coordinan cuidado a distancia</w:t>
+            </w:r>
+          </w:p>
+        </w:tc>
+      </w:tr>
+      <w:tr>
+        <w:tc>
+          <w:tcPr>
+            <w:tcW w:type="dxa" w:w="1200"/>
+            <w:shd w:fill="D6EAF8" w:val="clear"/>
+            <w:tcMar>
+              <w:top w:type="dxa" w:w="60"/>
+              <w:left w:type="dxa" w:w="100"/>
+              <w:bottom w:type="dxa" w:w="60"/>
+              <w:right w:type="dxa" w:w="100"/>
+            </w:tcMar>
+          </w:tcPr>
+          <w:p>
+            <w:pPr>
+              <w:spacing w:after="60" w:before="60"/>
+            </w:pPr>
+            <w:r>
+              <w:rPr>
+                <w:rFonts w:ascii="Calibri" w:cs="Calibri" w:eastAsia="Calibri" w:hAnsi="Calibri"/>
+                <w:color w:val="000000"/>
+                <w:sz w:val="18"/>
+                <w:szCs w:val="18"/>
+              </w:rPr>
               <w:t xml:space="preserve">SOM</w:t>
             </w:r>
           </w:p>
@@ -4323,78 +4429,78 @@
         <w:tc>
           <w:tcPr>
             <w:tcW w:type="dxa" w:w="3000"/>
-            <w:shd w:fill="FFFFFF" w:val="clear"/>
-            <w:tcMar>
-              <w:top w:type="dxa" w:w="60"/>
-              <w:left w:type="dxa" w:w="100"/>
-              <w:bottom w:type="dxa" w:w="60"/>
-              <w:right w:type="dxa" w:w="100"/>
-            </w:tcMar>
-          </w:tcPr>
-          <w:p>
-            <w:pPr>
-              <w:spacing w:after="60" w:before="60"/>
-            </w:pPr>
-            <w:r>
-              <w:rPr>
-                <w:rFonts w:ascii="Calibri" w:cs="Calibri" w:eastAsia="Calibri" w:hAnsi="Calibri"/>
-                <w:color w:val="000000"/>
-                <w:sz w:val="18"/>
-                <w:szCs w:val="18"/>
-              </w:rPr>
-              <w:t xml:space="preserve">Captura realista en 3–5 años (ciclo B2B)</w:t>
+            <w:shd w:fill="D6EAF8" w:val="clear"/>
+            <w:tcMar>
+              <w:top w:type="dxa" w:w="60"/>
+              <w:left w:type="dxa" w:w="100"/>
+              <w:bottom w:type="dxa" w:w="60"/>
+              <w:right w:type="dxa" w:w="100"/>
+            </w:tcMar>
+          </w:tcPr>
+          <w:p>
+            <w:pPr>
+              <w:spacing w:after="60" w:before="60"/>
+            </w:pPr>
+            <w:r>
+              <w:rPr>
+                <w:rFonts w:ascii="Calibri" w:cs="Calibri" w:eastAsia="Calibri" w:hAnsi="Calibri"/>
+                <w:color w:val="000000"/>
+                <w:sz w:val="18"/>
+                <w:szCs w:val="18"/>
+              </w:rPr>
+              <w:t xml:space="preserve">Captura realista en 3–5 años (ciclo B2B + freemium B2C)</w:t>
             </w:r>
           </w:p>
         </w:tc>
         <w:tc>
           <w:tcPr>
             <w:tcW w:type="dxa" w:w="2500"/>
-            <w:shd w:fill="FFFFFF" w:val="clear"/>
-            <w:tcMar>
-              <w:top w:type="dxa" w:w="60"/>
-              <w:left w:type="dxa" w:w="100"/>
-              <w:bottom w:type="dxa" w:w="60"/>
-              <w:right w:type="dxa" w:w="100"/>
-            </w:tcMar>
-          </w:tcPr>
-          <w:p>
-            <w:pPr>
-              <w:spacing w:after="60" w:before="60"/>
-            </w:pPr>
-            <w:r>
-              <w:rPr>
-                <w:rFonts w:ascii="Calibri" w:cs="Calibri" w:eastAsia="Calibri" w:hAnsi="Calibri"/>
-                <w:color w:val="000000"/>
-                <w:sz w:val="18"/>
-                <w:szCs w:val="18"/>
-              </w:rPr>
-              <w:t xml:space="preserve">50–200 residencias</w:t>
+            <w:shd w:fill="D6EAF8" w:val="clear"/>
+            <w:tcMar>
+              <w:top w:type="dxa" w:w="60"/>
+              <w:left w:type="dxa" w:w="100"/>
+              <w:bottom w:type="dxa" w:w="60"/>
+              <w:right w:type="dxa" w:w="100"/>
+            </w:tcMar>
+          </w:tcPr>
+          <w:p>
+            <w:pPr>
+              <w:spacing w:after="60" w:before="60"/>
+            </w:pPr>
+            <w:r>
+              <w:rPr>
+                <w:rFonts w:ascii="Calibri" w:cs="Calibri" w:eastAsia="Calibri" w:hAnsi="Calibri"/>
+                <w:color w:val="000000"/>
+                <w:sz w:val="18"/>
+                <w:szCs w:val="18"/>
+              </w:rPr>
+              <w:t xml:space="preserve">50–200 residencias + 5,000–20,000 familias</w:t>
             </w:r>
           </w:p>
         </w:tc>
         <w:tc>
           <w:tcPr>
             <w:tcW w:type="dxa" w:w="2300"/>
-            <w:shd w:fill="FFFFFF" w:val="clear"/>
-            <w:tcMar>
-              <w:top w:type="dxa" w:w="60"/>
-              <w:left w:type="dxa" w:w="100"/>
-              <w:bottom w:type="dxa" w:w="60"/>
-              <w:right w:type="dxa" w:w="100"/>
-            </w:tcMar>
-          </w:tcPr>
-          <w:p>
-            <w:pPr>
-              <w:spacing w:after="60" w:before="60"/>
-            </w:pPr>
-            <w:r>
-              <w:rPr>
-                <w:rFonts w:ascii="Calibri" w:cs="Calibri" w:eastAsia="Calibri" w:hAnsi="Calibri"/>
-                <w:color w:val="000000"/>
-                <w:sz w:val="18"/>
-                <w:szCs w:val="18"/>
-              </w:rPr>
-              <w:t xml:space="preserve">Pilotos + referencias + confianza</w:t>
+            <w:shd w:fill="D6EAF8" w:val="clear"/>
+            <w:tcMar>
+              <w:top w:type="dxa" w:w="60"/>
+              <w:left w:type="dxa" w:w="100"/>
+              <w:bottom w:type="dxa" w:w="60"/>
+              <w:right w:type="dxa" w:w="100"/>
+            </w:tcMar>
+          </w:tcPr>
+          <w:p>
+            <w:pPr>
+              <w:spacing w:after="60" w:before="60"/>
+            </w:pPr>
+            <w:r>
+              <w:rPr>
+                <w:rFonts w:ascii="Calibri" w:cs="Calibri" w:eastAsia="Calibri" w:hAnsi="Calibri"/>
+                <w:color w:val="000000"/>
+                <w:sz w:val="18"/>
+                <w:szCs w:val="18"/>
+              </w:rPr>
+              <w:t xml:space="preserve">Pilotos B2B + autoservicio freemium B2C</w:t>
             </w:r>
           </w:p>
         </w:tc>
@@ -4418,7 +4524,7 @@
           <w:sz w:val="26"/>
           <w:szCs w:val="26"/>
         </w:rPr>
-        <w:t xml:space="preserve">Revenue potencial del SOM</w:t>
+        <w:t xml:space="preserve">Revenue potencial del SOM — precios sweet-spot</w:t>
       </w:r>
     </w:p>
     <w:tbl>
@@ -4507,7 +4613,7 @@
         </w:tc>
         <w:tc>
           <w:tcPr>
-            <w:tcW w:type="dxa" w:w="2500"/>
+            <w:tcW w:type="dxa" w:w="2800"/>
             <w:shd w:fill="1A5276" w:val="clear"/>
             <w:tcMar>
               <w:top w:type="dxa" w:w="60"/>
@@ -4535,7 +4641,7 @@
         </w:tc>
         <w:tc>
           <w:tcPr>
-            <w:tcW w:type="dxa" w:w="2700"/>
+            <w:tcW w:type="dxa" w:w="2400"/>
             <w:shd w:fill="1A5276" w:val="clear"/>
             <w:tcMar>
               <w:top w:type="dxa" w:w="60"/>
@@ -4585,7 +4691,7 @@
                 <w:sz w:val="18"/>
                 <w:szCs w:val="18"/>
               </w:rPr>
-              <w:t xml:space="preserve">Conservador</w:t>
+              <w:t xml:space="preserve">Pesimista</w:t>
             </w:r>
           </w:p>
         </w:tc>
@@ -4611,59 +4717,59 @@
                 <w:sz w:val="18"/>
                 <w:szCs w:val="18"/>
               </w:rPr>
-              <w:t xml:space="preserve">50</w:t>
-            </w:r>
-          </w:p>
-        </w:tc>
-        <w:tc>
-          <w:tcPr>
-            <w:tcW w:type="dxa" w:w="2500"/>
-            <w:shd w:fill="FFFFFF" w:val="clear"/>
-            <w:tcMar>
-              <w:top w:type="dxa" w:w="60"/>
-              <w:left w:type="dxa" w:w="100"/>
-              <w:bottom w:type="dxa" w:w="60"/>
-              <w:right w:type="dxa" w:w="100"/>
-            </w:tcMar>
-          </w:tcPr>
-          <w:p>
-            <w:pPr>
-              <w:spacing w:after="60" w:before="60"/>
-            </w:pPr>
-            <w:r>
-              <w:rPr>
-                <w:rFonts w:ascii="Calibri" w:cs="Calibri" w:eastAsia="Calibri" w:hAnsi="Calibri"/>
-                <w:color w:val="000000"/>
-                <w:sz w:val="18"/>
-                <w:szCs w:val="18"/>
-              </w:rPr>
-              <w:t xml:space="preserve">Esencial ($1,490/mes)</w:t>
-            </w:r>
-          </w:p>
-        </w:tc>
-        <w:tc>
-          <w:tcPr>
-            <w:tcW w:type="dxa" w:w="2700"/>
-            <w:shd w:fill="FFFFFF" w:val="clear"/>
-            <w:tcMar>
-              <w:top w:type="dxa" w:w="60"/>
-              <w:left w:type="dxa" w:w="100"/>
-              <w:bottom w:type="dxa" w:w="60"/>
-              <w:right w:type="dxa" w:w="100"/>
-            </w:tcMar>
-          </w:tcPr>
-          <w:p>
-            <w:pPr>
-              <w:spacing w:after="60" w:before="60"/>
-            </w:pPr>
-            <w:r>
-              <w:rPr>
-                <w:rFonts w:ascii="Calibri" w:cs="Calibri" w:eastAsia="Calibri" w:hAnsi="Calibri"/>
-                <w:color w:val="000000"/>
-                <w:sz w:val="18"/>
-                <w:szCs w:val="18"/>
-              </w:rPr>
-              <w:t xml:space="preserve">~$74,500 MXN/mes</w:t>
+              <w:t xml:space="preserve">25–35</w:t>
+            </w:r>
+          </w:p>
+        </w:tc>
+        <w:tc>
+          <w:tcPr>
+            <w:tcW w:type="dxa" w:w="2800"/>
+            <w:shd w:fill="FFFFFF" w:val="clear"/>
+            <w:tcMar>
+              <w:top w:type="dxa" w:w="60"/>
+              <w:left w:type="dxa" w:w="100"/>
+              <w:bottom w:type="dxa" w:w="60"/>
+              <w:right w:type="dxa" w:w="100"/>
+            </w:tcMar>
+          </w:tcPr>
+          <w:p>
+            <w:pPr>
+              <w:spacing w:after="60" w:before="60"/>
+            </w:pPr>
+            <w:r>
+              <w:rPr>
+                <w:rFonts w:ascii="Calibri" w:cs="Calibri" w:eastAsia="Calibri" w:hAnsi="Calibri"/>
+                <w:color w:val="000000"/>
+                <w:sz w:val="18"/>
+                <w:szCs w:val="18"/>
+              </w:rPr>
+              <w:t xml:space="preserve">Esencial ($1,990/mes)</w:t>
+            </w:r>
+          </w:p>
+        </w:tc>
+        <w:tc>
+          <w:tcPr>
+            <w:tcW w:type="dxa" w:w="2400"/>
+            <w:shd w:fill="FFFFFF" w:val="clear"/>
+            <w:tcMar>
+              <w:top w:type="dxa" w:w="60"/>
+              <w:left w:type="dxa" w:w="100"/>
+              <w:bottom w:type="dxa" w:w="60"/>
+              <w:right w:type="dxa" w:w="100"/>
+            </w:tcMar>
+          </w:tcPr>
+          <w:p>
+            <w:pPr>
+              <w:spacing w:after="60" w:before="60"/>
+            </w:pPr>
+            <w:r>
+              <w:rPr>
+                <w:rFonts w:ascii="Calibri" w:cs="Calibri" w:eastAsia="Calibri" w:hAnsi="Calibri"/>
+                <w:color w:val="000000"/>
+                <w:sz w:val="18"/>
+                <w:szCs w:val="18"/>
+              </w:rPr>
+              <w:t xml:space="preserve">~$50k–$70k MXN/mes</w:t>
             </w:r>
           </w:p>
         </w:tc>
@@ -4691,7 +4797,7 @@
                 <w:sz w:val="18"/>
                 <w:szCs w:val="18"/>
               </w:rPr>
-              <w:t xml:space="preserve">Base</w:t>
+              <w:t xml:space="preserve">Equilibrado ⭐</w:t>
             </w:r>
           </w:p>
         </w:tc>
@@ -4717,59 +4823,59 @@
                 <w:sz w:val="18"/>
                 <w:szCs w:val="18"/>
               </w:rPr>
-              <w:t xml:space="preserve">100</w:t>
-            </w:r>
-          </w:p>
-        </w:tc>
-        <w:tc>
-          <w:tcPr>
-            <w:tcW w:type="dxa" w:w="2500"/>
-            <w:shd w:fill="D6EAF8" w:val="clear"/>
-            <w:tcMar>
-              <w:top w:type="dxa" w:w="60"/>
-              <w:left w:type="dxa" w:w="100"/>
-              <w:bottom w:type="dxa" w:w="60"/>
-              <w:right w:type="dxa" w:w="100"/>
-            </w:tcMar>
-          </w:tcPr>
-          <w:p>
-            <w:pPr>
-              <w:spacing w:after="60" w:before="60"/>
-            </w:pPr>
-            <w:r>
-              <w:rPr>
-                <w:rFonts w:ascii="Calibri" w:cs="Calibri" w:eastAsia="Calibri" w:hAnsi="Calibri"/>
-                <w:color w:val="000000"/>
-                <w:sz w:val="18"/>
-                <w:szCs w:val="18"/>
-              </w:rPr>
-              <w:t xml:space="preserve">Profesional ($3,490/mes)</w:t>
-            </w:r>
-          </w:p>
-        </w:tc>
-        <w:tc>
-          <w:tcPr>
-            <w:tcW w:type="dxa" w:w="2700"/>
-            <w:shd w:fill="D6EAF8" w:val="clear"/>
-            <w:tcMar>
-              <w:top w:type="dxa" w:w="60"/>
-              <w:left w:type="dxa" w:w="100"/>
-              <w:bottom w:type="dxa" w:w="60"/>
-              <w:right w:type="dxa" w:w="100"/>
-            </w:tcMar>
-          </w:tcPr>
-          <w:p>
-            <w:pPr>
-              <w:spacing w:after="60" w:before="60"/>
-            </w:pPr>
-            <w:r>
-              <w:rPr>
-                <w:rFonts w:ascii="Calibri" w:cs="Calibri" w:eastAsia="Calibri" w:hAnsi="Calibri"/>
-                <w:color w:val="000000"/>
-                <w:sz w:val="18"/>
-                <w:szCs w:val="18"/>
-              </w:rPr>
-              <w:t xml:space="preserve">~$349,000 MXN/mes</w:t>
+              <w:t xml:space="preserve">80–120</w:t>
+            </w:r>
+          </w:p>
+        </w:tc>
+        <w:tc>
+          <w:tcPr>
+            <w:tcW w:type="dxa" w:w="2800"/>
+            <w:shd w:fill="D6EAF8" w:val="clear"/>
+            <w:tcMar>
+              <w:top w:type="dxa" w:w="60"/>
+              <w:left w:type="dxa" w:w="100"/>
+              <w:bottom w:type="dxa" w:w="60"/>
+              <w:right w:type="dxa" w:w="100"/>
+            </w:tcMar>
+          </w:tcPr>
+          <w:p>
+            <w:pPr>
+              <w:spacing w:after="60" w:before="60"/>
+            </w:pPr>
+            <w:r>
+              <w:rPr>
+                <w:rFonts w:ascii="Calibri" w:cs="Calibri" w:eastAsia="Calibri" w:hAnsi="Calibri"/>
+                <w:color w:val="000000"/>
+                <w:sz w:val="18"/>
+                <w:szCs w:val="18"/>
+              </w:rPr>
+              <w:t xml:space="preserve">Profesional ($3,990/mes) — sweet spot</w:t>
+            </w:r>
+          </w:p>
+        </w:tc>
+        <w:tc>
+          <w:tcPr>
+            <w:tcW w:type="dxa" w:w="2400"/>
+            <w:shd w:fill="D6EAF8" w:val="clear"/>
+            <w:tcMar>
+              <w:top w:type="dxa" w:w="60"/>
+              <w:left w:type="dxa" w:w="100"/>
+              <w:bottom w:type="dxa" w:w="60"/>
+              <w:right w:type="dxa" w:w="100"/>
+            </w:tcMar>
+          </w:tcPr>
+          <w:p>
+            <w:pPr>
+              <w:spacing w:after="60" w:before="60"/>
+            </w:pPr>
+            <w:r>
+              <w:rPr>
+                <w:rFonts w:ascii="Calibri" w:cs="Calibri" w:eastAsia="Calibri" w:hAnsi="Calibri"/>
+                <w:color w:val="000000"/>
+                <w:sz w:val="18"/>
+                <w:szCs w:val="18"/>
+              </w:rPr>
+              <w:t xml:space="preserve">~$319k–$479k MXN/mes</w:t>
             </w:r>
           </w:p>
         </w:tc>
@@ -4797,7 +4903,7 @@
                 <w:sz w:val="18"/>
                 <w:szCs w:val="18"/>
               </w:rPr>
-              <w:t xml:space="preserve">Optimista</w:t>
+              <w:t xml:space="preserve">Positivo</w:t>
             </w:r>
           </w:p>
         </w:tc>
@@ -4823,64 +4929,81 @@
                 <w:sz w:val="18"/>
                 <w:szCs w:val="18"/>
               </w:rPr>
-              <w:t xml:space="preserve">200</w:t>
-            </w:r>
-          </w:p>
-        </w:tc>
-        <w:tc>
-          <w:tcPr>
-            <w:tcW w:type="dxa" w:w="2500"/>
-            <w:shd w:fill="FFFFFF" w:val="clear"/>
-            <w:tcMar>
-              <w:top w:type="dxa" w:w="60"/>
-              <w:left w:type="dxa" w:w="100"/>
-              <w:bottom w:type="dxa" w:w="60"/>
-              <w:right w:type="dxa" w:w="100"/>
-            </w:tcMar>
-          </w:tcPr>
-          <w:p>
-            <w:pPr>
-              <w:spacing w:after="60" w:before="60"/>
-            </w:pPr>
-            <w:r>
-              <w:rPr>
-                <w:rFonts w:ascii="Calibri" w:cs="Calibri" w:eastAsia="Calibri" w:hAnsi="Calibri"/>
-                <w:color w:val="000000"/>
-                <w:sz w:val="18"/>
-                <w:szCs w:val="18"/>
-              </w:rPr>
-              <w:t xml:space="preserve">Profesional ($3,490/mes)</w:t>
-            </w:r>
-          </w:p>
-        </w:tc>
-        <w:tc>
-          <w:tcPr>
-            <w:tcW w:type="dxa" w:w="2700"/>
-            <w:shd w:fill="FFFFFF" w:val="clear"/>
-            <w:tcMar>
-              <w:top w:type="dxa" w:w="60"/>
-              <w:left w:type="dxa" w:w="100"/>
-              <w:bottom w:type="dxa" w:w="60"/>
-              <w:right w:type="dxa" w:w="100"/>
-            </w:tcMar>
-          </w:tcPr>
-          <w:p>
-            <w:pPr>
-              <w:spacing w:after="60" w:before="60"/>
-            </w:pPr>
-            <w:r>
-              <w:rPr>
-                <w:rFonts w:ascii="Calibri" w:cs="Calibri" w:eastAsia="Calibri" w:hAnsi="Calibri"/>
-                <w:color w:val="000000"/>
-                <w:sz w:val="18"/>
-                <w:szCs w:val="18"/>
-              </w:rPr>
-              <w:t xml:space="preserve">~$698,000 MXN/mes</w:t>
+              <w:t xml:space="preserve">180–250</w:t>
+            </w:r>
+          </w:p>
+        </w:tc>
+        <w:tc>
+          <w:tcPr>
+            <w:tcW w:type="dxa" w:w="2800"/>
+            <w:shd w:fill="FFFFFF" w:val="clear"/>
+            <w:tcMar>
+              <w:top w:type="dxa" w:w="60"/>
+              <w:left w:type="dxa" w:w="100"/>
+              <w:bottom w:type="dxa" w:w="60"/>
+              <w:right w:type="dxa" w:w="100"/>
+            </w:tcMar>
+          </w:tcPr>
+          <w:p>
+            <w:pPr>
+              <w:spacing w:after="60" w:before="60"/>
+            </w:pPr>
+            <w:r>
+              <w:rPr>
+                <w:rFonts w:ascii="Calibri" w:cs="Calibri" w:eastAsia="Calibri" w:hAnsi="Calibri"/>
+                <w:color w:val="000000"/>
+                <w:sz w:val="18"/>
+                <w:szCs w:val="18"/>
+              </w:rPr>
+              <w:t xml:space="preserve">Mix Profesional + Institucional ($8,490)</w:t>
+            </w:r>
+          </w:p>
+        </w:tc>
+        <w:tc>
+          <w:tcPr>
+            <w:tcW w:type="dxa" w:w="2400"/>
+            <w:shd w:fill="FFFFFF" w:val="clear"/>
+            <w:tcMar>
+              <w:top w:type="dxa" w:w="60"/>
+              <w:left w:type="dxa" w:w="100"/>
+              <w:bottom w:type="dxa" w:w="60"/>
+              <w:right w:type="dxa" w:w="100"/>
+            </w:tcMar>
+          </w:tcPr>
+          <w:p>
+            <w:pPr>
+              <w:spacing w:after="60" w:before="60"/>
+            </w:pPr>
+            <w:r>
+              <w:rPr>
+                <w:rFonts w:ascii="Calibri" w:cs="Calibri" w:eastAsia="Calibri" w:hAnsi="Calibri"/>
+                <w:color w:val="000000"/>
+                <w:sz w:val="18"/>
+                <w:szCs w:val="18"/>
+              </w:rPr>
+              <w:t xml:space="preserve">~$717k–$997k MXN/mes</w:t>
             </w:r>
           </w:p>
         </w:tc>
       </w:tr>
     </w:tbl>
+    <w:p>
+      <w:pPr>
+        <w:spacing w:after="120"/>
+        <w:ind w:left="566"/>
+      </w:pPr>
+      <w:r>
+        <w:rPr>
+          <w:rFonts w:ascii="Calibri" w:cs="Calibri" w:eastAsia="Calibri" w:hAnsi="Calibri"/>
+          <w:i/>
+          <w:iCs/>
+          <w:color w:val="CA6F1E"/>
+          <w:sz w:val="20"/>
+          <w:szCs w:val="20"/>
+        </w:rPr>
+        <w:t xml:space="preserve">⚠ Nota: Freemium $0 no genera MRR directo — reduce CAC y acelera conversión a planes pagos. Margen bruto estimado &gt; 80%.</w:t>
+      </w:r>
+    </w:p>
     <w:p/>
     <w:p>
       <w:pPr>
@@ -5727,7 +5850,7 @@
                 <w:sz w:val="18"/>
                 <w:szCs w:val="18"/>
               </w:rPr>
-              <w:t xml:space="preserve">✅ 3 planes publicados</w:t>
+              <w:t xml:space="preserve">✅ Freemium $0 + 3 planes ($1,990–$8,490)</w:t>
             </w:r>
           </w:p>
         </w:tc>

</xml_diff>